<commit_message>
Task(general): Modified model_er and model_relational in the documentation.
</commit_message>
<xml_diff>
--- a/documentation/memoria.docx
+++ b/documentation/memoria.docx
@@ -3614,25 +3614,51 @@
       <w:r>
         <w:t xml:space="preserve">Fig. </w:t>
       </w:r>
-      <w:fldSimple w:instr=" STYLEREF 1 \s ">
-        <w:r>
-          <w:rPr>
-            <w:noProof/>
-          </w:rPr>
-          <w:t>1</w:t>
-        </w:r>
-      </w:fldSimple>
+      <w:r>
+        <w:fldChar w:fldCharType="begin"/>
+      </w:r>
+      <w:r>
+        <w:instrText xml:space="preserve"> STYLEREF 1 \s </w:instrText>
+      </w:r>
+      <w:r>
+        <w:fldChar w:fldCharType="separate"/>
+      </w:r>
+      <w:r>
+        <w:rPr>
+          <w:noProof/>
+        </w:rPr>
+        <w:t>1</w:t>
+      </w:r>
+      <w:r>
+        <w:rPr>
+          <w:noProof/>
+        </w:rPr>
+        <w:fldChar w:fldCharType="end"/>
+      </w:r>
       <w:r>
         <w:noBreakHyphen/>
       </w:r>
-      <w:fldSimple w:instr=" SEQ Fig. \* ARABIC \s 1 ">
-        <w:r>
-          <w:rPr>
-            <w:noProof/>
-          </w:rPr>
-          <w:t>1</w:t>
-        </w:r>
-      </w:fldSimple>
+      <w:r>
+        <w:fldChar w:fldCharType="begin"/>
+      </w:r>
+      <w:r>
+        <w:instrText xml:space="preserve"> SEQ Fig. \* ARABIC \s 1 </w:instrText>
+      </w:r>
+      <w:r>
+        <w:fldChar w:fldCharType="separate"/>
+      </w:r>
+      <w:r>
+        <w:rPr>
+          <w:noProof/>
+        </w:rPr>
+        <w:t>1</w:t>
+      </w:r>
+      <w:r>
+        <w:rPr>
+          <w:noProof/>
+        </w:rPr>
+        <w:fldChar w:fldCharType="end"/>
+      </w:r>
       <w:r>
         <w:t>-Pantalla inicial de la aplicación</w:t>
       </w:r>
@@ -4284,25 +4310,51 @@
       <w:r>
         <w:t xml:space="preserve">Tabla </w:t>
       </w:r>
-      <w:fldSimple w:instr=" STYLEREF 1 \s ">
-        <w:r>
-          <w:rPr>
-            <w:noProof/>
-          </w:rPr>
-          <w:t>2</w:t>
-        </w:r>
-      </w:fldSimple>
+      <w:r>
+        <w:fldChar w:fldCharType="begin"/>
+      </w:r>
+      <w:r>
+        <w:instrText xml:space="preserve"> STYLEREF 1 \s </w:instrText>
+      </w:r>
+      <w:r>
+        <w:fldChar w:fldCharType="separate"/>
+      </w:r>
+      <w:r>
+        <w:rPr>
+          <w:noProof/>
+        </w:rPr>
+        <w:t>2</w:t>
+      </w:r>
+      <w:r>
+        <w:rPr>
+          <w:noProof/>
+        </w:rPr>
+        <w:fldChar w:fldCharType="end"/>
+      </w:r>
       <w:r>
         <w:noBreakHyphen/>
       </w:r>
-      <w:fldSimple w:instr=" SEQ Tabla \* ARABIC \s 1 ">
-        <w:r>
-          <w:rPr>
-            <w:noProof/>
-          </w:rPr>
-          <w:t>1</w:t>
-        </w:r>
-      </w:fldSimple>
+      <w:r>
+        <w:fldChar w:fldCharType="begin"/>
+      </w:r>
+      <w:r>
+        <w:instrText xml:space="preserve"> SEQ Tabla \* ARABIC \s 1 </w:instrText>
+      </w:r>
+      <w:r>
+        <w:fldChar w:fldCharType="separate"/>
+      </w:r>
+      <w:r>
+        <w:rPr>
+          <w:noProof/>
+        </w:rPr>
+        <w:t>1</w:t>
+      </w:r>
+      <w:r>
+        <w:rPr>
+          <w:noProof/>
+        </w:rPr>
+        <w:fldChar w:fldCharType="end"/>
+      </w:r>
       <w:r>
         <w:t>: Planificación temporal del proyecto</w:t>
       </w:r>
@@ -4864,25 +4916,51 @@
       <w:r>
         <w:t xml:space="preserve">Tabla </w:t>
       </w:r>
-      <w:fldSimple w:instr=" STYLEREF 1 \s ">
-        <w:r>
-          <w:rPr>
-            <w:noProof/>
-          </w:rPr>
-          <w:t>2</w:t>
-        </w:r>
-      </w:fldSimple>
+      <w:r>
+        <w:fldChar w:fldCharType="begin"/>
+      </w:r>
+      <w:r>
+        <w:instrText xml:space="preserve"> STYLEREF 1 \s </w:instrText>
+      </w:r>
+      <w:r>
+        <w:fldChar w:fldCharType="separate"/>
+      </w:r>
+      <w:r>
+        <w:rPr>
+          <w:noProof/>
+        </w:rPr>
+        <w:t>2</w:t>
+      </w:r>
+      <w:r>
+        <w:rPr>
+          <w:noProof/>
+        </w:rPr>
+        <w:fldChar w:fldCharType="end"/>
+      </w:r>
       <w:r>
         <w:noBreakHyphen/>
       </w:r>
-      <w:fldSimple w:instr=" SEQ Tabla \* ARABIC \s 1 ">
-        <w:r>
-          <w:rPr>
-            <w:noProof/>
-          </w:rPr>
-          <w:t>2</w:t>
-        </w:r>
-      </w:fldSimple>
+      <w:r>
+        <w:fldChar w:fldCharType="begin"/>
+      </w:r>
+      <w:r>
+        <w:instrText xml:space="preserve"> SEQ Tabla \* ARABIC \s 1 </w:instrText>
+      </w:r>
+      <w:r>
+        <w:fldChar w:fldCharType="separate"/>
+      </w:r>
+      <w:r>
+        <w:rPr>
+          <w:noProof/>
+        </w:rPr>
+        <w:t>2</w:t>
+      </w:r>
+      <w:r>
+        <w:rPr>
+          <w:noProof/>
+        </w:rPr>
+        <w:fldChar w:fldCharType="end"/>
+      </w:r>
       <w:r>
         <w:t>- Presupuesto del proyecto</w:t>
       </w:r>
@@ -5684,15 +5762,13 @@
       </w:pPr>
       <w:r>
         <w:rPr>
-          <w:rFonts w:eastAsia="Calibri"/>
           <w:noProof/>
-          <w:szCs w:val="24"/>
         </w:rPr>
         <w:drawing>
-          <wp:inline distT="0" distB="0" distL="0" distR="0" wp14:anchorId="6048E750" wp14:editId="10A90FBF">
-            <wp:extent cx="4931927" cy="7018020"/>
+          <wp:inline distT="0" distB="0" distL="0" distR="0" wp14:anchorId="3C137782" wp14:editId="25B06654">
+            <wp:extent cx="5400040" cy="4415155"/>
             <wp:effectExtent l="0" t="0" r="0" b="0"/>
-            <wp:docPr id="3" name="Picture 3"/>
+            <wp:docPr id="4" name="Picture 4"/>
             <wp:cNvGraphicFramePr>
               <a:graphicFrameLocks xmlns:a="http://schemas.openxmlformats.org/drawingml/2006/main" noChangeAspect="1"/>
             </wp:cNvGraphicFramePr>
@@ -5700,8 +5776,10 @@
               <a:graphicData uri="http://schemas.openxmlformats.org/drawingml/2006/picture">
                 <pic:pic xmlns:pic="http://schemas.openxmlformats.org/drawingml/2006/picture">
                   <pic:nvPicPr>
-                    <pic:cNvPr id="3" name="er_diagram.jpg"/>
-                    <pic:cNvPicPr/>
+                    <pic:cNvPr id="0" name="Picture 4"/>
+                    <pic:cNvPicPr>
+                      <a:picLocks noChangeAspect="1" noChangeArrowheads="1"/>
+                    </pic:cNvPicPr>
                   </pic:nvPicPr>
                   <pic:blipFill>
                     <a:blip r:embed="rId10">
@@ -5711,18 +5789,23 @@
                         </a:ext>
                       </a:extLst>
                     </a:blip>
+                    <a:srcRect/>
                     <a:stretch>
                       <a:fillRect/>
                     </a:stretch>
                   </pic:blipFill>
-                  <pic:spPr>
+                  <pic:spPr bwMode="auto">
                     <a:xfrm>
                       <a:off x="0" y="0"/>
-                      <a:ext cx="4944200" cy="7035485"/>
+                      <a:ext cx="5400040" cy="4415155"/>
                     </a:xfrm>
                     <a:prstGeom prst="rect">
                       <a:avLst/>
                     </a:prstGeom>
+                    <a:noFill/>
+                    <a:ln>
+                      <a:noFill/>
+                    </a:ln>
                   </pic:spPr>
                 </pic:pic>
               </a:graphicData>
@@ -5745,6 +5828,26 @@
     </w:p>
     <w:p>
       <w:pPr>
+        <w:spacing w:line="276" w:lineRule="auto"/>
+        <w:jc w:val="left"/>
+        <w:rPr>
+          <w:rFonts w:eastAsiaTheme="majorEastAsia" w:cstheme="majorBidi"/>
+          <w:b/>
+          <w:bCs/>
+          <w:color w:val="548DD4" w:themeColor="text2" w:themeTint="99"/>
+          <w:sz w:val="28"/>
+          <w:lang w:val="es-ES"/>
+        </w:rPr>
+      </w:pPr>
+      <w:r>
+        <w:rPr>
+          <w:lang w:val="es-ES"/>
+        </w:rPr>
+        <w:br w:type="page"/>
+      </w:r>
+    </w:p>
+    <w:p>
+      <w:pPr>
         <w:pStyle w:val="Heading3"/>
         <w:rPr>
           <w:lang w:val="es-ES"/>
@@ -5754,6 +5857,7 @@
         <w:rPr>
           <w:lang w:val="es-ES"/>
         </w:rPr>
+        <w:lastRenderedPageBreak/>
         <w:t>Modelo relacional</w:t>
       </w:r>
     </w:p>
@@ -5771,120 +5875,275 @@
         </w:rPr>
         <w:t>Diseño relacional de la base de datos.</w:t>
       </w:r>
+    </w:p>
+    <w:p>
+      <w:pPr>
+        <w:rPr>
+          <w:color w:val="D9D9D9" w:themeColor="background1" w:themeShade="D9"/>
+          <w:lang w:val="es-ES"/>
+        </w:rPr>
+      </w:pPr>
+      <w:r>
+        <w:rPr>
+          <w:noProof/>
+        </w:rPr>
+        <w:drawing>
+          <wp:inline distT="0" distB="0" distL="0" distR="0" wp14:anchorId="5066404D" wp14:editId="5BB97E99">
+            <wp:extent cx="5400040" cy="7847965"/>
+            <wp:effectExtent l="0" t="0" r="0" b="0"/>
+            <wp:docPr id="6" name="Picture 6"/>
+            <wp:cNvGraphicFramePr>
+              <a:graphicFrameLocks xmlns:a="http://schemas.openxmlformats.org/drawingml/2006/main" noChangeAspect="1"/>
+            </wp:cNvGraphicFramePr>
+            <a:graphic xmlns:a="http://schemas.openxmlformats.org/drawingml/2006/main">
+              <a:graphicData uri="http://schemas.openxmlformats.org/drawingml/2006/picture">
+                <pic:pic xmlns:pic="http://schemas.openxmlformats.org/drawingml/2006/picture">
+                  <pic:nvPicPr>
+                    <pic:cNvPr id="0" name="Picture 11"/>
+                    <pic:cNvPicPr>
+                      <a:picLocks noChangeAspect="1" noChangeArrowheads="1"/>
+                    </pic:cNvPicPr>
+                  </pic:nvPicPr>
+                  <pic:blipFill>
+                    <a:blip r:embed="rId11">
+                      <a:extLst>
+                        <a:ext uri="{28A0092B-C50C-407E-A947-70E740481C1C}">
+                          <a14:useLocalDpi xmlns:a14="http://schemas.microsoft.com/office/drawing/2010/main" val="0"/>
+                        </a:ext>
+                      </a:extLst>
+                    </a:blip>
+                    <a:srcRect/>
+                    <a:stretch>
+                      <a:fillRect/>
+                    </a:stretch>
+                  </pic:blipFill>
+                  <pic:spPr bwMode="auto">
+                    <a:xfrm>
+                      <a:off x="0" y="0"/>
+                      <a:ext cx="5400040" cy="7847965"/>
+                    </a:xfrm>
+                    <a:prstGeom prst="rect">
+                      <a:avLst/>
+                    </a:prstGeom>
+                    <a:noFill/>
+                    <a:ln>
+                      <a:noFill/>
+                    </a:ln>
+                  </pic:spPr>
+                </pic:pic>
+              </a:graphicData>
+            </a:graphic>
+          </wp:inline>
+        </w:drawing>
+      </w:r>
+    </w:p>
+    <w:p>
+      <w:pPr>
+        <w:spacing w:line="276" w:lineRule="auto"/>
+        <w:jc w:val="left"/>
+        <w:rPr>
+          <w:rFonts w:eastAsiaTheme="majorEastAsia" w:cstheme="majorBidi"/>
+          <w:b/>
+          <w:bCs/>
+          <w:color w:val="548DD4" w:themeColor="text2" w:themeTint="99"/>
+          <w:sz w:val="28"/>
+          <w:lang w:val="es-ES"/>
+        </w:rPr>
+      </w:pPr>
+      <w:r>
+        <w:rPr>
+          <w:lang w:val="es-ES"/>
+        </w:rPr>
+        <w:br w:type="page"/>
+      </w:r>
+    </w:p>
+    <w:p>
+      <w:pPr>
+        <w:pStyle w:val="Heading3"/>
+        <w:jc w:val="left"/>
+        <w:rPr>
+          <w:lang w:val="es-ES"/>
+        </w:rPr>
+      </w:pPr>
+      <w:r>
+        <w:rPr>
+          <w:lang w:val="es-ES"/>
+        </w:rPr>
+        <w:lastRenderedPageBreak/>
+        <w:t>P</w:t>
+      </w:r>
+      <w:r>
+        <w:rPr>
+          <w:lang w:val="es-ES"/>
+        </w:rPr>
+        <w:t>atrones de diseño</w:t>
+      </w:r>
+      <w:r>
+        <w:rPr>
+          <w:lang w:val="es-ES"/>
+        </w:rPr>
+        <w:t xml:space="preserve"> del software</w:t>
+      </w:r>
+    </w:p>
+    <w:p>
+      <w:pPr>
+        <w:rPr>
+          <w:lang w:val="es-ES"/>
+        </w:rPr>
+      </w:pPr>
+      <w:r>
+        <w:rPr>
+          <w:lang w:val="es-ES"/>
+        </w:rPr>
+        <w:t>Justificación de patrones utilizados</w:t>
+      </w:r>
+      <w:r>
+        <w:rPr>
+          <w:lang w:val="es-ES"/>
+        </w:rPr>
+        <w:t>.</w:t>
+      </w:r>
+    </w:p>
+    <w:p>
+      <w:pPr>
+        <w:rPr>
+          <w:lang w:val="es-ES"/>
+        </w:rPr>
+      </w:pPr>
+      <w:r>
+        <w:rPr>
+          <w:lang w:val="es-ES"/>
+        </w:rPr>
+        <w:t xml:space="preserve">Organización </w:t>
+      </w:r>
+      <w:r>
+        <w:rPr>
+          <w:lang w:val="es-ES"/>
+        </w:rPr>
+        <w:t xml:space="preserve">del código </w:t>
+      </w:r>
+      <w:r>
+        <w:rPr>
+          <w:lang w:val="es-ES"/>
+        </w:rPr>
+        <w:t xml:space="preserve">y estructura de la aplicación (diagrama general). </w:t>
+      </w:r>
+    </w:p>
+    <w:p>
+      <w:pPr>
+        <w:rPr>
+          <w:lang w:val="es-ES"/>
+        </w:rPr>
+      </w:pPr>
+      <w:r>
+        <w:rPr>
+          <w:lang w:val="es-ES"/>
+        </w:rPr>
+        <w:t>Incluir algún ejemplo de código. Como puede</w:t>
+      </w:r>
+      <w:r>
+        <w:rPr>
+          <w:lang w:val="es-ES"/>
+        </w:rPr>
+        <w:t xml:space="preserve"> ser</w:t>
+      </w:r>
+      <w:r>
+        <w:rPr>
+          <w:lang w:val="es-ES"/>
+        </w:rPr>
+        <w:t xml:space="preserve"> </w:t>
+      </w:r>
+      <w:r>
+        <w:rPr>
+          <w:lang w:val="es-ES"/>
+        </w:rPr>
+        <w:t>algún fragmento del</w:t>
+      </w:r>
+      <w:r>
+        <w:rPr>
+          <w:lang w:val="es-ES"/>
+        </w:rPr>
+        <w:t xml:space="preserve"> modelo, controlador y vista.</w:t>
+      </w:r>
+    </w:p>
+    <w:p>
+      <w:pPr>
+        <w:rPr>
+          <w:lang w:val="es-ES"/>
+        </w:rPr>
+      </w:pPr>
+    </w:p>
+    <w:p>
+      <w:pPr>
+        <w:pStyle w:val="ListParagraph"/>
+        <w:numPr>
+          <w:ilvl w:val="0"/>
+          <w:numId w:val="19"/>
+        </w:numPr>
+        <w:rPr>
+          <w:lang w:val="es-ES"/>
+        </w:rPr>
+      </w:pPr>
+      <w:r>
+        <w:rPr>
+          <w:lang w:val="es-ES"/>
+        </w:rPr>
+        <w:t>Est</w:t>
+      </w:r>
+      <w:r>
+        <w:rPr>
+          <w:lang w:val="es-ES"/>
+        </w:rPr>
+        <w:t>r</w:t>
+      </w:r>
       <w:bookmarkStart w:id="21" w:name="_GoBack"/>
       <w:bookmarkEnd w:id="21"/>
+      <w:r>
+        <w:rPr>
+          <w:lang w:val="es-ES"/>
+        </w:rPr>
+        <w:t>uctura</w:t>
+      </w:r>
+    </w:p>
+    <w:p>
+      <w:pPr>
+        <w:pStyle w:val="ListParagraph"/>
+        <w:numPr>
+          <w:ilvl w:val="0"/>
+          <w:numId w:val="19"/>
+        </w:numPr>
+        <w:rPr>
+          <w:lang w:val="es-ES"/>
+        </w:rPr>
+      </w:pPr>
+      <w:r>
+        <w:rPr>
+          <w:lang w:val="es-ES"/>
+        </w:rPr>
+        <w:t>Ejemplos de CRUD de tickets (sin middleware) tanto MVC</w:t>
+      </w:r>
+    </w:p>
+    <w:p>
+      <w:pPr>
+        <w:pStyle w:val="ListParagraph"/>
+        <w:numPr>
+          <w:ilvl w:val="0"/>
+          <w:numId w:val="19"/>
+        </w:numPr>
+        <w:rPr>
+          <w:lang w:val="es-ES"/>
+        </w:rPr>
+      </w:pPr>
+      <w:r>
+        <w:rPr>
+          <w:lang w:val="es-ES"/>
+        </w:rPr>
+        <w:t>Acceso y permisos</w:t>
+      </w:r>
     </w:p>
     <w:p>
       <w:pPr>
         <w:pStyle w:val="Heading3"/>
-        <w:jc w:val="left"/>
-        <w:rPr>
-          <w:lang w:val="es-ES"/>
-        </w:rPr>
-      </w:pPr>
-      <w:r>
-        <w:rPr>
-          <w:lang w:val="es-ES"/>
-        </w:rPr>
-        <w:t>P</w:t>
-      </w:r>
-      <w:r>
-        <w:rPr>
-          <w:lang w:val="es-ES"/>
-        </w:rPr>
-        <w:t>atrones de diseño</w:t>
-      </w:r>
-      <w:r>
-        <w:rPr>
-          <w:lang w:val="es-ES"/>
-        </w:rPr>
-        <w:t xml:space="preserve"> del software</w:t>
-      </w:r>
-    </w:p>
-    <w:p>
-      <w:pPr>
-        <w:rPr>
-          <w:lang w:val="es-ES"/>
-        </w:rPr>
-      </w:pPr>
-      <w:r>
-        <w:rPr>
-          <w:lang w:val="es-ES"/>
-        </w:rPr>
-        <w:t>Justificación de patrones utilizados</w:t>
-      </w:r>
-      <w:r>
-        <w:rPr>
-          <w:lang w:val="es-ES"/>
-        </w:rPr>
-        <w:t>.</w:t>
-      </w:r>
-    </w:p>
-    <w:p>
-      <w:pPr>
-        <w:rPr>
-          <w:lang w:val="es-ES"/>
-        </w:rPr>
-      </w:pPr>
-      <w:r>
-        <w:rPr>
-          <w:lang w:val="es-ES"/>
-        </w:rPr>
-        <w:t xml:space="preserve">Organización </w:t>
-      </w:r>
-      <w:r>
-        <w:rPr>
-          <w:lang w:val="es-ES"/>
-        </w:rPr>
-        <w:t xml:space="preserve">del código </w:t>
-      </w:r>
-      <w:r>
-        <w:rPr>
-          <w:lang w:val="es-ES"/>
-        </w:rPr>
-        <w:t xml:space="preserve">y estructura de la aplicación (diagrama general). </w:t>
-      </w:r>
-    </w:p>
-    <w:p>
-      <w:pPr>
-        <w:rPr>
-          <w:lang w:val="es-ES"/>
-        </w:rPr>
-      </w:pPr>
-      <w:r>
-        <w:rPr>
-          <w:lang w:val="es-ES"/>
-        </w:rPr>
-        <w:t>Incluir algún ejemplo de código. Como puede</w:t>
-      </w:r>
-      <w:r>
-        <w:rPr>
-          <w:lang w:val="es-ES"/>
-        </w:rPr>
-        <w:t xml:space="preserve"> ser</w:t>
-      </w:r>
-      <w:r>
-        <w:rPr>
-          <w:lang w:val="es-ES"/>
-        </w:rPr>
-        <w:t xml:space="preserve"> </w:t>
-      </w:r>
-      <w:r>
-        <w:rPr>
-          <w:lang w:val="es-ES"/>
-        </w:rPr>
-        <w:t>algún fragmento del</w:t>
-      </w:r>
-      <w:r>
-        <w:rPr>
-          <w:lang w:val="es-ES"/>
-        </w:rPr>
-        <w:t xml:space="preserve"> modelo, controlador y vista.</w:t>
-      </w:r>
-    </w:p>
-    <w:p>
-      <w:pPr>
-        <w:pStyle w:val="Heading3"/>
       </w:pPr>
       <w:bookmarkStart w:id="22" w:name="_Toc477346605"/>
       <w:r>
@@ -5954,6 +6213,23 @@
       </w:r>
       <w:r>
         <w:t>….</w:t>
+      </w:r>
+    </w:p>
+    <w:p>
+      <w:pPr>
+        <w:ind w:left="567"/>
+      </w:pPr>
+    </w:p>
+    <w:p>
+      <w:pPr>
+        <w:pStyle w:val="ListParagraph"/>
+        <w:numPr>
+          <w:ilvl w:val="0"/>
+          <w:numId w:val="19"/>
+        </w:numPr>
+      </w:pPr>
+      <w:r>
+        <w:t>Guía de estilos básica</w:t>
       </w:r>
     </w:p>
     <w:p>
@@ -5987,7 +6263,7 @@
                     <pic:cNvPicPr/>
                   </pic:nvPicPr>
                   <pic:blipFill>
-                    <a:blip r:embed="rId11">
+                    <a:blip r:embed="rId12">
                       <a:extLst>
                         <a:ext uri="{28A0092B-C50C-407E-A947-70E740481C1C}">
                           <a14:useLocalDpi xmlns:a14="http://schemas.microsoft.com/office/drawing/2010/main" val="0"/>
@@ -6028,31 +6304,59 @@
         </w:rPr>
         <w:t xml:space="preserve">Fig. </w:t>
       </w:r>
-      <w:fldSimple w:instr=" STYLEREF 1 \s ">
-        <w:r>
-          <w:rPr>
-            <w:noProof/>
-            <w:lang w:val="es-ES"/>
-          </w:rPr>
-          <w:t>4</w:t>
-        </w:r>
-      </w:fldSimple>
+      <w:r>
+        <w:fldChar w:fldCharType="begin"/>
+      </w:r>
+      <w:r>
+        <w:instrText xml:space="preserve"> STYLEREF 1 \s </w:instrText>
+      </w:r>
+      <w:r>
+        <w:fldChar w:fldCharType="separate"/>
+      </w:r>
+      <w:r>
+        <w:rPr>
+          <w:noProof/>
+          <w:lang w:val="es-ES"/>
+        </w:rPr>
+        <w:t>4</w:t>
+      </w:r>
+      <w:r>
+        <w:rPr>
+          <w:noProof/>
+          <w:lang w:val="es-ES"/>
+        </w:rPr>
+        <w:fldChar w:fldCharType="end"/>
+      </w:r>
       <w:r>
         <w:noBreakHyphen/>
       </w:r>
-      <w:fldSimple w:instr=" SEQ Fig. \* ARABIC \s 1 ">
-        <w:r>
-          <w:rPr>
-            <w:noProof/>
-            <w:lang w:val="es-ES"/>
-          </w:rPr>
-          <w:t>1</w:t>
-        </w:r>
-      </w:fldSimple>
-      <w:r>
-        <w:rPr>
+      <w:r>
+        <w:fldChar w:fldCharType="begin"/>
+      </w:r>
+      <w:r>
+        <w:instrText xml:space="preserve"> SEQ Fig. \* ARABIC \s 1 </w:instrText>
+      </w:r>
+      <w:r>
+        <w:fldChar w:fldCharType="separate"/>
+      </w:r>
+      <w:r>
+        <w:rPr>
+          <w:noProof/>
           <w:lang w:val="es-ES"/>
         </w:rPr>
+        <w:t>1</w:t>
+      </w:r>
+      <w:r>
+        <w:rPr>
+          <w:noProof/>
+          <w:lang w:val="es-ES"/>
+        </w:rPr>
+        <w:fldChar w:fldCharType="end"/>
+      </w:r>
+      <w:r>
+        <w:rPr>
+          <w:lang w:val="es-ES"/>
+        </w:rPr>
         <w:t>-</w:t>
       </w:r>
       <w:r>
@@ -6065,6 +6369,19 @@
     </w:p>
     <w:p>
       <w:pPr>
+        <w:rPr>
+          <w:lang w:val="es-ES"/>
+        </w:rPr>
+      </w:pPr>
+      <w:r>
+        <w:rPr>
+          <w:lang w:val="es-ES"/>
+        </w:rPr>
+        <w:t>(Esto puede ser una captura de pantalla al final)</w:t>
+      </w:r>
+    </w:p>
+    <w:p>
+      <w:pPr>
         <w:ind w:left="567"/>
       </w:pPr>
     </w:p>
@@ -6156,7 +6473,6 @@
         <w:rPr>
           <w:lang w:val="es-ES"/>
         </w:rPr>
-        <w:lastRenderedPageBreak/>
         <w:t xml:space="preserve"> </w:t>
       </w:r>
       <w:bookmarkStart w:id="25" w:name="_Toc477346607"/>
@@ -6777,8 +7093,8 @@
       </w:r>
     </w:p>
     <w:sectPr>
-      <w:headerReference w:type="default" r:id="rId12"/>
-      <w:footerReference w:type="default" r:id="rId13"/>
+      <w:headerReference w:type="default" r:id="rId13"/>
+      <w:footerReference w:type="default" r:id="rId14"/>
       <w:pgSz w:w="11906" w:h="16838" w:code="9"/>
       <w:pgMar w:top="1418" w:right="1701" w:bottom="1418" w:left="1701" w:header="709" w:footer="709" w:gutter="0"/>
       <w:cols w:space="708"/>
@@ -8043,6 +8359,118 @@
     <w:numStyleLink w:val="Estilo1"/>
   </w:abstractNum>
   <w:abstractNum w:abstractNumId="11" w15:restartNumberingAfterBreak="0">
+    <w:nsid w:val="5CEE6785"/>
+    <w:multiLevelType w:val="hybridMultilevel"/>
+    <w:tmpl w:val="9F7CF37A"/>
+    <w:lvl w:ilvl="0" w:tplc="EF4CCED6">
+      <w:numFmt w:val="bullet"/>
+      <w:lvlText w:val="-"/>
+      <w:lvlJc w:val="left"/>
+      <w:pPr>
+        <w:ind w:left="720" w:hanging="360"/>
+      </w:pPr>
+      <w:rPr>
+        <w:rFonts w:ascii="Times New Roman" w:eastAsiaTheme="minorHAnsi" w:hAnsi="Times New Roman" w:cs="Times New Roman" w:hint="default"/>
+      </w:rPr>
+    </w:lvl>
+    <w:lvl w:ilvl="1" w:tplc="08090003" w:tentative="1">
+      <w:start w:val="1"/>
+      <w:numFmt w:val="bullet"/>
+      <w:lvlText w:val="o"/>
+      <w:lvlJc w:val="left"/>
+      <w:pPr>
+        <w:ind w:left="1440" w:hanging="360"/>
+      </w:pPr>
+      <w:rPr>
+        <w:rFonts w:ascii="Courier New" w:hAnsi="Courier New" w:cs="Courier New" w:hint="default"/>
+      </w:rPr>
+    </w:lvl>
+    <w:lvl w:ilvl="2" w:tplc="08090005" w:tentative="1">
+      <w:start w:val="1"/>
+      <w:numFmt w:val="bullet"/>
+      <w:lvlText w:val=""/>
+      <w:lvlJc w:val="left"/>
+      <w:pPr>
+        <w:ind w:left="2160" w:hanging="360"/>
+      </w:pPr>
+      <w:rPr>
+        <w:rFonts w:ascii="Wingdings" w:hAnsi="Wingdings" w:hint="default"/>
+      </w:rPr>
+    </w:lvl>
+    <w:lvl w:ilvl="3" w:tplc="08090001" w:tentative="1">
+      <w:start w:val="1"/>
+      <w:numFmt w:val="bullet"/>
+      <w:lvlText w:val=""/>
+      <w:lvlJc w:val="left"/>
+      <w:pPr>
+        <w:ind w:left="2880" w:hanging="360"/>
+      </w:pPr>
+      <w:rPr>
+        <w:rFonts w:ascii="Symbol" w:hAnsi="Symbol" w:hint="default"/>
+      </w:rPr>
+    </w:lvl>
+    <w:lvl w:ilvl="4" w:tplc="08090003" w:tentative="1">
+      <w:start w:val="1"/>
+      <w:numFmt w:val="bullet"/>
+      <w:lvlText w:val="o"/>
+      <w:lvlJc w:val="left"/>
+      <w:pPr>
+        <w:ind w:left="3600" w:hanging="360"/>
+      </w:pPr>
+      <w:rPr>
+        <w:rFonts w:ascii="Courier New" w:hAnsi="Courier New" w:cs="Courier New" w:hint="default"/>
+      </w:rPr>
+    </w:lvl>
+    <w:lvl w:ilvl="5" w:tplc="08090005" w:tentative="1">
+      <w:start w:val="1"/>
+      <w:numFmt w:val="bullet"/>
+      <w:lvlText w:val=""/>
+      <w:lvlJc w:val="left"/>
+      <w:pPr>
+        <w:ind w:left="4320" w:hanging="360"/>
+      </w:pPr>
+      <w:rPr>
+        <w:rFonts w:ascii="Wingdings" w:hAnsi="Wingdings" w:hint="default"/>
+      </w:rPr>
+    </w:lvl>
+    <w:lvl w:ilvl="6" w:tplc="08090001" w:tentative="1">
+      <w:start w:val="1"/>
+      <w:numFmt w:val="bullet"/>
+      <w:lvlText w:val=""/>
+      <w:lvlJc w:val="left"/>
+      <w:pPr>
+        <w:ind w:left="5040" w:hanging="360"/>
+      </w:pPr>
+      <w:rPr>
+        <w:rFonts w:ascii="Symbol" w:hAnsi="Symbol" w:hint="default"/>
+      </w:rPr>
+    </w:lvl>
+    <w:lvl w:ilvl="7" w:tplc="08090003" w:tentative="1">
+      <w:start w:val="1"/>
+      <w:numFmt w:val="bullet"/>
+      <w:lvlText w:val="o"/>
+      <w:lvlJc w:val="left"/>
+      <w:pPr>
+        <w:ind w:left="5760" w:hanging="360"/>
+      </w:pPr>
+      <w:rPr>
+        <w:rFonts w:ascii="Courier New" w:hAnsi="Courier New" w:cs="Courier New" w:hint="default"/>
+      </w:rPr>
+    </w:lvl>
+    <w:lvl w:ilvl="8" w:tplc="08090005" w:tentative="1">
+      <w:start w:val="1"/>
+      <w:numFmt w:val="bullet"/>
+      <w:lvlText w:val=""/>
+      <w:lvlJc w:val="left"/>
+      <w:pPr>
+        <w:ind w:left="6480" w:hanging="360"/>
+      </w:pPr>
+      <w:rPr>
+        <w:rFonts w:ascii="Wingdings" w:hAnsi="Wingdings" w:hint="default"/>
+      </w:rPr>
+    </w:lvl>
+  </w:abstractNum>
+  <w:abstractNum w:abstractNumId="12" w15:restartNumberingAfterBreak="0">
     <w:nsid w:val="617758EA"/>
     <w:multiLevelType w:val="multilevel"/>
     <w:tmpl w:val="0C0A001D"/>
@@ -8128,7 +8556,7 @@
       </w:pPr>
     </w:lvl>
   </w:abstractNum>
-  <w:abstractNum w:abstractNumId="12" w15:restartNumberingAfterBreak="0">
+  <w:abstractNum w:abstractNumId="13" w15:restartNumberingAfterBreak="0">
     <w:nsid w:val="6809716E"/>
     <w:multiLevelType w:val="hybridMultilevel"/>
     <w:tmpl w:val="CA744A84"/>
@@ -8241,7 +8669,7 @@
       </w:rPr>
     </w:lvl>
   </w:abstractNum>
-  <w:abstractNum w:abstractNumId="13" w15:restartNumberingAfterBreak="0">
+  <w:abstractNum w:abstractNumId="14" w15:restartNumberingAfterBreak="0">
     <w:nsid w:val="6EB43C8B"/>
     <w:multiLevelType w:val="hybridMultilevel"/>
     <w:tmpl w:val="7D5A5AE2"/>
@@ -8354,7 +8782,7 @@
       </w:rPr>
     </w:lvl>
   </w:abstractNum>
-  <w:abstractNum w:abstractNumId="14" w15:restartNumberingAfterBreak="0">
+  <w:abstractNum w:abstractNumId="15" w15:restartNumberingAfterBreak="0">
     <w:nsid w:val="6FD87839"/>
     <w:multiLevelType w:val="hybridMultilevel"/>
     <w:tmpl w:val="E1D2C1C6"/>
@@ -8467,7 +8895,7 @@
       </w:rPr>
     </w:lvl>
   </w:abstractNum>
-  <w:abstractNum w:abstractNumId="15" w15:restartNumberingAfterBreak="0">
+  <w:abstractNum w:abstractNumId="16" w15:restartNumberingAfterBreak="0">
     <w:nsid w:val="7B3E5E49"/>
     <w:multiLevelType w:val="multilevel"/>
     <w:tmpl w:val="901ADE68"/>
@@ -8483,13 +8911,13 @@
     <w:abstractNumId w:val="3"/>
   </w:num>
   <w:num w:numId="4">
-    <w:abstractNumId w:val="13"/>
+    <w:abstractNumId w:val="14"/>
   </w:num>
   <w:num w:numId="5">
     <w:abstractNumId w:val="9"/>
   </w:num>
   <w:num w:numId="6">
-    <w:abstractNumId w:val="15"/>
+    <w:abstractNumId w:val="16"/>
   </w:num>
   <w:num w:numId="7">
     <w:abstractNumId w:val="7"/>
@@ -8501,7 +8929,7 @@
     <w:abstractNumId w:val="1"/>
   </w:num>
   <w:num w:numId="10">
-    <w:abstractNumId w:val="14"/>
+    <w:abstractNumId w:val="15"/>
   </w:num>
   <w:num w:numId="11">
     <w:abstractNumId w:val="10"/>
@@ -8516,16 +8944,19 @@
     <w:abstractNumId w:val="8"/>
   </w:num>
   <w:num w:numId="15">
-    <w:abstractNumId w:val="11"/>
+    <w:abstractNumId w:val="12"/>
   </w:num>
   <w:num w:numId="16">
     <w:abstractNumId w:val="5"/>
   </w:num>
   <w:num w:numId="17">
-    <w:abstractNumId w:val="12"/>
+    <w:abstractNumId w:val="13"/>
   </w:num>
   <w:num w:numId="18">
     <w:abstractNumId w:val="5"/>
+  </w:num>
+  <w:num w:numId="19">
+    <w:abstractNumId w:val="11"/>
   </w:num>
 </w:numbering>
 </file>
@@ -9079,6 +9510,7 @@
   <w:style w:type="character" w:default="1" w:styleId="DefaultParagraphFont">
     <w:name w:val="Default Paragraph Font"/>
     <w:uiPriority w:val="1"/>
+    <w:semiHidden/>
     <w:unhideWhenUsed/>
   </w:style>
   <w:style w:type="table" w:default="1" w:styleId="TableNormal">
@@ -9887,7 +10319,7 @@
 </file>
 
 <file path=customXml/itemProps1.xml><?xml version="1.0" encoding="utf-8"?>
-<ds:datastoreItem xmlns:ds="http://schemas.openxmlformats.org/officeDocument/2006/customXml" ds:itemID="{5D72B5B5-E575-4AC0-BB3D-740759625366}">
+<ds:datastoreItem xmlns:ds="http://schemas.openxmlformats.org/officeDocument/2006/customXml" ds:itemID="{18CD6F32-3C48-4C66-8B80-6080A444B35E}">
   <ds:schemaRefs>
     <ds:schemaRef ds:uri="http://schemas.openxmlformats.org/officeDocument/2006/bibliography"/>
   </ds:schemaRefs>

</xml_diff>

<commit_message>
Feat(f): Add unassigned tickets filter. Changed filter icons.
</commit_message>
<xml_diff>
--- a/documentation/memoria.docx
+++ b/documentation/memoria.docx
@@ -3614,51 +3614,25 @@
       <w:r>
         <w:t xml:space="preserve">Fig. </w:t>
       </w:r>
-      <w:r>
-        <w:fldChar w:fldCharType="begin"/>
-      </w:r>
-      <w:r>
-        <w:instrText xml:space="preserve"> STYLEREF 1 \s </w:instrText>
-      </w:r>
-      <w:r>
-        <w:fldChar w:fldCharType="separate"/>
-      </w:r>
-      <w:r>
-        <w:rPr>
-          <w:noProof/>
-        </w:rPr>
-        <w:t>1</w:t>
-      </w:r>
-      <w:r>
-        <w:rPr>
-          <w:noProof/>
-        </w:rPr>
-        <w:fldChar w:fldCharType="end"/>
-      </w:r>
+      <w:fldSimple w:instr=" STYLEREF 1 \s ">
+        <w:r>
+          <w:rPr>
+            <w:noProof/>
+          </w:rPr>
+          <w:t>1</w:t>
+        </w:r>
+      </w:fldSimple>
       <w:r>
         <w:noBreakHyphen/>
       </w:r>
-      <w:r>
-        <w:fldChar w:fldCharType="begin"/>
-      </w:r>
-      <w:r>
-        <w:instrText xml:space="preserve"> SEQ Fig. \* ARABIC \s 1 </w:instrText>
-      </w:r>
-      <w:r>
-        <w:fldChar w:fldCharType="separate"/>
-      </w:r>
-      <w:r>
-        <w:rPr>
-          <w:noProof/>
-        </w:rPr>
-        <w:t>1</w:t>
-      </w:r>
-      <w:r>
-        <w:rPr>
-          <w:noProof/>
-        </w:rPr>
-        <w:fldChar w:fldCharType="end"/>
-      </w:r>
+      <w:fldSimple w:instr=" SEQ Fig. \* ARABIC \s 1 ">
+        <w:r>
+          <w:rPr>
+            <w:noProof/>
+          </w:rPr>
+          <w:t>1</w:t>
+        </w:r>
+      </w:fldSimple>
       <w:r>
         <w:t>-Pantalla inicial de la aplicación</w:t>
       </w:r>
@@ -3749,37 +3723,63 @@
         </w:numPr>
         <w:rPr>
           <w:i/>
-        </w:rPr>
-      </w:pPr>
-      <w:r>
-        <w:rPr>
-          <w:i/>
+          <w:strike/>
+        </w:rPr>
+      </w:pPr>
+      <w:r>
+        <w:rPr>
+          <w:i/>
+          <w:strike/>
         </w:rPr>
         <w:t>Registr</w:t>
       </w:r>
       <w:r>
         <w:rPr>
           <w:i/>
+          <w:strike/>
         </w:rPr>
         <w:t>o de</w:t>
       </w:r>
       <w:r>
         <w:rPr>
           <w:i/>
+          <w:strike/>
         </w:rPr>
         <w:t xml:space="preserve"> nuevos usuarios e inici</w:t>
       </w:r>
       <w:r>
         <w:rPr>
           <w:i/>
+          <w:strike/>
         </w:rPr>
         <w:t>o de</w:t>
       </w:r>
       <w:r>
         <w:rPr>
           <w:i/>
+          <w:strike/>
         </w:rPr>
         <w:t xml:space="preserve"> sesión</w:t>
+      </w:r>
+    </w:p>
+    <w:p>
+      <w:pPr>
+        <w:pStyle w:val="ListParagraph"/>
+        <w:numPr>
+          <w:ilvl w:val="1"/>
+          <w:numId w:val="2"/>
+        </w:numPr>
+        <w:rPr>
+          <w:i/>
+          <w:strike/>
+        </w:rPr>
+      </w:pPr>
+      <w:r>
+        <w:rPr>
+          <w:i/>
+          <w:strike/>
+        </w:rPr>
+        <w:t>Roles</w:t>
       </w:r>
     </w:p>
     <w:p>
@@ -3797,19 +3797,7 @@
         <w:rPr>
           <w:i/>
         </w:rPr>
-        <w:t>Crea</w:t>
-      </w:r>
-      <w:r>
-        <w:rPr>
-          <w:i/>
-        </w:rPr>
-        <w:t>ción</w:t>
-      </w:r>
-      <w:r>
-        <w:rPr>
-          <w:i/>
-        </w:rPr>
-        <w:t xml:space="preserve"> tickets</w:t>
+        <w:t>Habrá tres roles de usuario: administrador, técnico y usuario</w:t>
       </w:r>
     </w:p>
     <w:p>
@@ -3827,19 +3815,43 @@
         <w:rPr>
           <w:i/>
         </w:rPr>
-        <w:t>Asigna</w:t>
-      </w:r>
-      <w:r>
-        <w:rPr>
-          <w:i/>
-        </w:rPr>
-        <w:t>ción de</w:t>
-      </w:r>
-      <w:r>
-        <w:rPr>
-          <w:i/>
-        </w:rPr>
-        <w:t xml:space="preserve"> tickets a técnicos</w:t>
+        <w:t>El administrador podrá</w:t>
+      </w:r>
+    </w:p>
+    <w:p>
+      <w:pPr>
+        <w:pStyle w:val="ListParagraph"/>
+        <w:numPr>
+          <w:ilvl w:val="1"/>
+          <w:numId w:val="2"/>
+        </w:numPr>
+        <w:rPr>
+          <w:i/>
+        </w:rPr>
+      </w:pPr>
+      <w:r>
+        <w:rPr>
+          <w:i/>
+        </w:rPr>
+        <w:t>Crear, modificar (excepto contraseña) y eliminar usuarios</w:t>
+      </w:r>
+    </w:p>
+    <w:p>
+      <w:pPr>
+        <w:pStyle w:val="ListParagraph"/>
+        <w:numPr>
+          <w:ilvl w:val="1"/>
+          <w:numId w:val="2"/>
+        </w:numPr>
+        <w:rPr>
+          <w:i/>
+        </w:rPr>
+      </w:pPr>
+      <w:r>
+        <w:rPr>
+          <w:i/>
+        </w:rPr>
+        <w:t>Crear, modificar y eliminar todos los tiquets</w:t>
       </w:r>
     </w:p>
     <w:p>
@@ -3857,41 +3869,225 @@
         <w:rPr>
           <w:i/>
         </w:rPr>
+        <w:t>El técnico podrá</w:t>
+      </w:r>
+    </w:p>
+    <w:p>
+      <w:pPr>
+        <w:pStyle w:val="ListParagraph"/>
+        <w:numPr>
+          <w:ilvl w:val="1"/>
+          <w:numId w:val="2"/>
+        </w:numPr>
+        <w:rPr>
+          <w:i/>
+        </w:rPr>
+      </w:pPr>
+      <w:r>
+        <w:rPr>
+          <w:i/>
+        </w:rPr>
+        <w:t>Asignar tiquets a sí mismo</w:t>
+      </w:r>
+    </w:p>
+    <w:p>
+      <w:pPr>
+        <w:pStyle w:val="ListParagraph"/>
+        <w:numPr>
+          <w:ilvl w:val="1"/>
+          <w:numId w:val="2"/>
+        </w:numPr>
+        <w:rPr>
+          <w:i/>
+        </w:rPr>
+      </w:pPr>
+      <w:r>
+        <w:rPr>
+          <w:i/>
+        </w:rPr>
+        <w:t>Cambiar el estado de sus tiquets</w:t>
+      </w:r>
+    </w:p>
+    <w:p>
+      <w:pPr>
+        <w:pStyle w:val="ListParagraph"/>
+        <w:numPr>
+          <w:ilvl w:val="0"/>
+          <w:numId w:val="2"/>
+        </w:numPr>
+        <w:rPr>
+          <w:i/>
+        </w:rPr>
+      </w:pPr>
+      <w:r>
+        <w:rPr>
+          <w:i/>
+        </w:rPr>
+        <w:t>Todos los usuarios podrán:</w:t>
+      </w:r>
+    </w:p>
+    <w:p>
+      <w:pPr>
+        <w:pStyle w:val="ListParagraph"/>
+        <w:numPr>
+          <w:ilvl w:val="1"/>
+          <w:numId w:val="2"/>
+        </w:numPr>
+        <w:rPr>
+          <w:i/>
+        </w:rPr>
+      </w:pPr>
+      <w:r>
+        <w:rPr>
+          <w:i/>
+        </w:rPr>
+        <w:t>Crear tiquets. Modificar y eliminar los tiquets que ha creado.</w:t>
+      </w:r>
+    </w:p>
+    <w:p>
+      <w:pPr>
+        <w:pStyle w:val="ListParagraph"/>
+        <w:numPr>
+          <w:ilvl w:val="1"/>
+          <w:numId w:val="2"/>
+        </w:numPr>
+        <w:rPr>
+          <w:i/>
+        </w:rPr>
+      </w:pPr>
+      <w:r>
+        <w:rPr>
+          <w:i/>
+        </w:rPr>
+        <w:t>Modificar su perfil (contraseña)</w:t>
+      </w:r>
+    </w:p>
+    <w:p>
+      <w:pPr>
+        <w:pStyle w:val="ListParagraph"/>
+        <w:numPr>
+          <w:ilvl w:val="0"/>
+          <w:numId w:val="2"/>
+        </w:numPr>
+        <w:rPr>
+          <w:i/>
+          <w:strike/>
+        </w:rPr>
+      </w:pPr>
+      <w:r>
+        <w:rPr>
+          <w:i/>
+          <w:strike/>
+        </w:rPr>
+        <w:t>Crea</w:t>
+      </w:r>
+      <w:r>
+        <w:rPr>
+          <w:i/>
+          <w:strike/>
+        </w:rPr>
+        <w:t>ción</w:t>
+      </w:r>
+      <w:r>
+        <w:rPr>
+          <w:i/>
+          <w:strike/>
+        </w:rPr>
+        <w:t xml:space="preserve"> tickets</w:t>
+      </w:r>
+    </w:p>
+    <w:p>
+      <w:pPr>
+        <w:pStyle w:val="ListParagraph"/>
+        <w:numPr>
+          <w:ilvl w:val="0"/>
+          <w:numId w:val="2"/>
+        </w:numPr>
+        <w:rPr>
+          <w:i/>
+          <w:strike/>
+        </w:rPr>
+      </w:pPr>
+      <w:r>
+        <w:rPr>
+          <w:i/>
+          <w:strike/>
+        </w:rPr>
+        <w:t>Asigna</w:t>
+      </w:r>
+      <w:r>
+        <w:rPr>
+          <w:i/>
+          <w:strike/>
+        </w:rPr>
+        <w:t>ción de</w:t>
+      </w:r>
+      <w:r>
+        <w:rPr>
+          <w:i/>
+          <w:strike/>
+        </w:rPr>
+        <w:t xml:space="preserve"> tickets a técnicos</w:t>
+      </w:r>
+    </w:p>
+    <w:p>
+      <w:pPr>
+        <w:pStyle w:val="ListParagraph"/>
+        <w:numPr>
+          <w:ilvl w:val="0"/>
+          <w:numId w:val="2"/>
+        </w:numPr>
+        <w:rPr>
+          <w:i/>
+          <w:strike/>
+        </w:rPr>
+      </w:pPr>
+      <w:r>
+        <w:rPr>
+          <w:i/>
+          <w:strike/>
+        </w:rPr>
         <w:t>Cambi</w:t>
       </w:r>
       <w:r>
         <w:rPr>
           <w:i/>
+          <w:strike/>
         </w:rPr>
         <w:t>o</w:t>
       </w:r>
       <w:r>
         <w:rPr>
           <w:i/>
+          <w:strike/>
         </w:rPr>
         <w:t xml:space="preserve"> </w:t>
       </w:r>
       <w:r>
         <w:rPr>
           <w:i/>
+          <w:strike/>
         </w:rPr>
         <w:t>de</w:t>
       </w:r>
       <w:r>
         <w:rPr>
           <w:i/>
+          <w:strike/>
         </w:rPr>
         <w:t xml:space="preserve"> estado de </w:t>
       </w:r>
       <w:r>
         <w:rPr>
           <w:i/>
+          <w:strike/>
         </w:rPr>
         <w:t>los</w:t>
       </w:r>
       <w:r>
         <w:rPr>
           <w:i/>
+          <w:strike/>
         </w:rPr>
         <w:t xml:space="preserve"> tickets</w:t>
       </w:r>
@@ -4142,6 +4338,7 @@
       </w:pPr>
       <w:bookmarkStart w:id="12" w:name="_Toc477346597"/>
       <w:r>
+        <w:lastRenderedPageBreak/>
         <w:t>Recursos software</w:t>
       </w:r>
       <w:bookmarkEnd w:id="12"/>
@@ -4292,7 +4489,6 @@
         <w:pStyle w:val="Heading2"/>
       </w:pPr>
       <w:r>
-        <w:lastRenderedPageBreak/>
         <w:t xml:space="preserve"> </w:t>
       </w:r>
       <w:bookmarkStart w:id="13" w:name="_Toc477346598"/>
@@ -4310,51 +4506,25 @@
       <w:r>
         <w:t xml:space="preserve">Tabla </w:t>
       </w:r>
-      <w:r>
-        <w:fldChar w:fldCharType="begin"/>
-      </w:r>
-      <w:r>
-        <w:instrText xml:space="preserve"> STYLEREF 1 \s </w:instrText>
-      </w:r>
-      <w:r>
-        <w:fldChar w:fldCharType="separate"/>
-      </w:r>
-      <w:r>
-        <w:rPr>
-          <w:noProof/>
-        </w:rPr>
-        <w:t>2</w:t>
-      </w:r>
-      <w:r>
-        <w:rPr>
-          <w:noProof/>
-        </w:rPr>
-        <w:fldChar w:fldCharType="end"/>
-      </w:r>
+      <w:fldSimple w:instr=" STYLEREF 1 \s ">
+        <w:r>
+          <w:rPr>
+            <w:noProof/>
+          </w:rPr>
+          <w:t>2</w:t>
+        </w:r>
+      </w:fldSimple>
       <w:r>
         <w:noBreakHyphen/>
       </w:r>
-      <w:r>
-        <w:fldChar w:fldCharType="begin"/>
-      </w:r>
-      <w:r>
-        <w:instrText xml:space="preserve"> SEQ Tabla \* ARABIC \s 1 </w:instrText>
-      </w:r>
-      <w:r>
-        <w:fldChar w:fldCharType="separate"/>
-      </w:r>
-      <w:r>
-        <w:rPr>
-          <w:noProof/>
-        </w:rPr>
-        <w:t>1</w:t>
-      </w:r>
-      <w:r>
-        <w:rPr>
-          <w:noProof/>
-        </w:rPr>
-        <w:fldChar w:fldCharType="end"/>
-      </w:r>
+      <w:fldSimple w:instr=" SEQ Tabla \* ARABIC \s 1 ">
+        <w:r>
+          <w:rPr>
+            <w:noProof/>
+          </w:rPr>
+          <w:t>1</w:t>
+        </w:r>
+      </w:fldSimple>
       <w:r>
         <w:t>: Planificación temporal del proyecto</w:t>
       </w:r>
@@ -4916,51 +5086,25 @@
       <w:r>
         <w:t xml:space="preserve">Tabla </w:t>
       </w:r>
-      <w:r>
-        <w:fldChar w:fldCharType="begin"/>
-      </w:r>
-      <w:r>
-        <w:instrText xml:space="preserve"> STYLEREF 1 \s </w:instrText>
-      </w:r>
-      <w:r>
-        <w:fldChar w:fldCharType="separate"/>
-      </w:r>
-      <w:r>
-        <w:rPr>
-          <w:noProof/>
-        </w:rPr>
-        <w:t>2</w:t>
-      </w:r>
-      <w:r>
-        <w:rPr>
-          <w:noProof/>
-        </w:rPr>
-        <w:fldChar w:fldCharType="end"/>
-      </w:r>
+      <w:fldSimple w:instr=" STYLEREF 1 \s ">
+        <w:r>
+          <w:rPr>
+            <w:noProof/>
+          </w:rPr>
+          <w:t>2</w:t>
+        </w:r>
+      </w:fldSimple>
       <w:r>
         <w:noBreakHyphen/>
       </w:r>
-      <w:r>
-        <w:fldChar w:fldCharType="begin"/>
-      </w:r>
-      <w:r>
-        <w:instrText xml:space="preserve"> SEQ Tabla \* ARABIC \s 1 </w:instrText>
-      </w:r>
-      <w:r>
-        <w:fldChar w:fldCharType="separate"/>
-      </w:r>
-      <w:r>
-        <w:rPr>
-          <w:noProof/>
-        </w:rPr>
-        <w:t>2</w:t>
-      </w:r>
-      <w:r>
-        <w:rPr>
-          <w:noProof/>
-        </w:rPr>
-        <w:fldChar w:fldCharType="end"/>
-      </w:r>
+      <w:fldSimple w:instr=" SEQ Tabla \* ARABIC \s 1 ">
+        <w:r>
+          <w:rPr>
+            <w:noProof/>
+          </w:rPr>
+          <w:t>2</w:t>
+        </w:r>
+      </w:fldSimple>
       <w:r>
         <w:t>- Presupuesto del proyecto</w:t>
       </w:r>
@@ -5559,6 +5703,7 @@
         <w:rPr>
           <w:i/>
         </w:rPr>
+        <w:lastRenderedPageBreak/>
         <w:t>HTML: estructura de la web</w:t>
       </w:r>
     </w:p>
@@ -6096,14 +6241,20 @@
         </w:rPr>
         <w:t>r</w:t>
       </w:r>
+      <w:r>
+        <w:rPr>
+          <w:lang w:val="es-ES"/>
+        </w:rPr>
+        <w:t>uctura</w:t>
+      </w:r>
+      <w:r>
+        <w:rPr>
+          <w:lang w:val="es-ES"/>
+        </w:rPr>
+        <w:t xml:space="preserve"> de carpetas</w:t>
+      </w:r>
       <w:bookmarkStart w:id="21" w:name="_GoBack"/>
       <w:bookmarkEnd w:id="21"/>
-      <w:r>
-        <w:rPr>
-          <w:lang w:val="es-ES"/>
-        </w:rPr>
-        <w:t>uctura</w:t>
-      </w:r>
     </w:p>
     <w:p>
       <w:pPr>
@@ -6139,6 +6290,24 @@
           <w:lang w:val="es-ES"/>
         </w:rPr>
         <w:t>Acceso y permisos</w:t>
+      </w:r>
+    </w:p>
+    <w:p>
+      <w:pPr>
+        <w:pStyle w:val="ListParagraph"/>
+        <w:numPr>
+          <w:ilvl w:val="0"/>
+          <w:numId w:val="19"/>
+        </w:numPr>
+        <w:rPr>
+          <w:lang w:val="es-ES"/>
+        </w:rPr>
+      </w:pPr>
+      <w:r>
+        <w:rPr>
+          <w:lang w:val="es-ES"/>
+        </w:rPr>
+        <w:t>Middlewares</w:t>
       </w:r>
     </w:p>
     <w:p>
@@ -6304,55 +6473,27 @@
         </w:rPr>
         <w:t xml:space="preserve">Fig. </w:t>
       </w:r>
-      <w:r>
-        <w:fldChar w:fldCharType="begin"/>
-      </w:r>
-      <w:r>
-        <w:instrText xml:space="preserve"> STYLEREF 1 \s </w:instrText>
-      </w:r>
-      <w:r>
-        <w:fldChar w:fldCharType="separate"/>
-      </w:r>
-      <w:r>
-        <w:rPr>
-          <w:noProof/>
-          <w:lang w:val="es-ES"/>
-        </w:rPr>
-        <w:t>4</w:t>
-      </w:r>
-      <w:r>
-        <w:rPr>
-          <w:noProof/>
-          <w:lang w:val="es-ES"/>
-        </w:rPr>
-        <w:fldChar w:fldCharType="end"/>
-      </w:r>
+      <w:fldSimple w:instr=" STYLEREF 1 \s ">
+        <w:r>
+          <w:rPr>
+            <w:noProof/>
+            <w:lang w:val="es-ES"/>
+          </w:rPr>
+          <w:t>4</w:t>
+        </w:r>
+      </w:fldSimple>
       <w:r>
         <w:noBreakHyphen/>
       </w:r>
-      <w:r>
-        <w:fldChar w:fldCharType="begin"/>
-      </w:r>
-      <w:r>
-        <w:instrText xml:space="preserve"> SEQ Fig. \* ARABIC \s 1 </w:instrText>
-      </w:r>
-      <w:r>
-        <w:fldChar w:fldCharType="separate"/>
-      </w:r>
-      <w:r>
-        <w:rPr>
-          <w:noProof/>
-          <w:lang w:val="es-ES"/>
-        </w:rPr>
-        <w:t>1</w:t>
-      </w:r>
-      <w:r>
-        <w:rPr>
-          <w:noProof/>
-          <w:lang w:val="es-ES"/>
-        </w:rPr>
-        <w:fldChar w:fldCharType="end"/>
-      </w:r>
+      <w:fldSimple w:instr=" SEQ Fig. \* ARABIC \s 1 ">
+        <w:r>
+          <w:rPr>
+            <w:noProof/>
+            <w:lang w:val="es-ES"/>
+          </w:rPr>
+          <w:t>1</w:t>
+        </w:r>
+      </w:fldSimple>
       <w:r>
         <w:rPr>
           <w:lang w:val="es-ES"/>
@@ -7465,7 +7606,7 @@
         <w:rFonts w:ascii="Wingdings" w:hAnsi="Wingdings" w:hint="default"/>
       </w:rPr>
     </w:lvl>
-    <w:lvl w:ilvl="1" w:tplc="040A0003" w:tentative="1">
+    <w:lvl w:ilvl="1" w:tplc="040A0003">
       <w:start w:val="1"/>
       <w:numFmt w:val="bullet"/>
       <w:lvlText w:val="o"/>
@@ -10319,7 +10460,7 @@
 </file>
 
 <file path=customXml/itemProps1.xml><?xml version="1.0" encoding="utf-8"?>
-<ds:datastoreItem xmlns:ds="http://schemas.openxmlformats.org/officeDocument/2006/customXml" ds:itemID="{18CD6F32-3C48-4C66-8B80-6080A444B35E}">
+<ds:datastoreItem xmlns:ds="http://schemas.openxmlformats.org/officeDocument/2006/customXml" ds:itemID="{F4101D47-3235-40F0-B6B7-A47B7E989414}">
   <ds:schemaRefs>
     <ds:schemaRef ds:uri="http://schemas.openxmlformats.org/officeDocument/2006/bibliography"/>
   </ds:schemaRefs>

</xml_diff>